<commit_message>
Kịch bản thi ghi chi phí đo thật; thêm kết quả buổi dùng thử 16/10, chạy thử demo và tài liệu khó khăn – giải pháp
Co-Authored-By: Claude Opus 5.5 <noreply@anthropic.com>
</commit_message>
<xml_diff>
--- a/bao-cao/kich-ban-thi/Kich_ban_thi.docx
+++ b/bao-cao/kich-ban-thi/Kich_ban_thi.docx
@@ -55,7 +55,7 @@
           <w:b/>
           <w:i w:val="0"/>
         </w:rPr>
-        <w:t>6 phút trình bày và demo, 4 phút trả lời phản biện</w:t>
+        <w:t>khoảng 6 phút trình bày và demo, gần 4 phút trả lời phản biện</w:t>
       </w:r>
       <w:r>
         <w:rPr>
@@ -85,7 +85,7 @@
         </w:trPr>
         <w:tc>
           <w:tcPr>
-            <w:tcW w:type="dxa" w:w="1883"/>
+            <w:tcW w:type="dxa" w:w="1822"/>
             <w:shd w:val="clear" w:fill="FDE7E0"/>
           </w:tcPr>
           <w:p>
@@ -104,7 +104,7 @@
         </w:tc>
         <w:tc>
           <w:tcPr>
-            <w:tcW w:type="dxa" w:w="2731"/>
+            <w:tcW w:type="dxa" w:w="2955"/>
             <w:shd w:val="clear" w:fill="FDE7E0"/>
           </w:tcPr>
           <w:p>
@@ -123,7 +123,7 @@
         </w:tc>
         <w:tc>
           <w:tcPr>
-            <w:tcW w:type="dxa" w:w="2773"/>
+            <w:tcW w:type="dxa" w:w="2684"/>
             <w:shd w:val="clear" w:fill="FDE7E0"/>
           </w:tcPr>
           <w:p>
@@ -142,7 +142,7 @@
         </w:tc>
         <w:tc>
           <w:tcPr>
-            <w:tcW w:type="dxa" w:w="2365"/>
+            <w:tcW w:type="dxa" w:w="2289"/>
             <w:shd w:val="clear" w:fill="FDE7E0"/>
           </w:tcPr>
           <w:p>
@@ -166,7 +166,7 @@
         </w:trPr>
         <w:tc>
           <w:tcPr>
-            <w:tcW w:type="dxa" w:w="1883"/>
+            <w:tcW w:type="dxa" w:w="1822"/>
           </w:tcPr>
           <w:p>
             <w:pPr>
@@ -184,7 +184,7 @@
         </w:tc>
         <w:tc>
           <w:tcPr>
-            <w:tcW w:type="dxa" w:w="2731"/>
+            <w:tcW w:type="dxa" w:w="2955"/>
           </w:tcPr>
           <w:p>
             <w:pPr>
@@ -202,7 +202,7 @@
         </w:tc>
         <w:tc>
           <w:tcPr>
-            <w:tcW w:type="dxa" w:w="2773"/>
+            <w:tcW w:type="dxa" w:w="2684"/>
           </w:tcPr>
           <w:p>
             <w:pPr>
@@ -220,7 +220,7 @@
         </w:tc>
         <w:tc>
           <w:tcPr>
-            <w:tcW w:type="dxa" w:w="2365"/>
+            <w:tcW w:type="dxa" w:w="2289"/>
           </w:tcPr>
           <w:p>
             <w:pPr>
@@ -243,7 +243,7 @@
         </w:trPr>
         <w:tc>
           <w:tcPr>
-            <w:tcW w:type="dxa" w:w="1883"/>
+            <w:tcW w:type="dxa" w:w="1822"/>
           </w:tcPr>
           <w:p>
             <w:pPr>
@@ -261,7 +261,7 @@
         </w:tc>
         <w:tc>
           <w:tcPr>
-            <w:tcW w:type="dxa" w:w="2731"/>
+            <w:tcW w:type="dxa" w:w="2955"/>
           </w:tcPr>
           <w:p>
             <w:pPr>
@@ -279,7 +279,7 @@
         </w:tc>
         <w:tc>
           <w:tcPr>
-            <w:tcW w:type="dxa" w:w="2773"/>
+            <w:tcW w:type="dxa" w:w="2684"/>
           </w:tcPr>
           <w:p>
             <w:pPr>
@@ -297,7 +297,7 @@
         </w:tc>
         <w:tc>
           <w:tcPr>
-            <w:tcW w:type="dxa" w:w="2365"/>
+            <w:tcW w:type="dxa" w:w="2289"/>
           </w:tcPr>
           <w:p>
             <w:pPr>
@@ -320,7 +320,7 @@
         </w:trPr>
         <w:tc>
           <w:tcPr>
-            <w:tcW w:type="dxa" w:w="1883"/>
+            <w:tcW w:type="dxa" w:w="1822"/>
           </w:tcPr>
           <w:p>
             <w:pPr>
@@ -338,7 +338,7 @@
         </w:tc>
         <w:tc>
           <w:tcPr>
-            <w:tcW w:type="dxa" w:w="2731"/>
+            <w:tcW w:type="dxa" w:w="2955"/>
           </w:tcPr>
           <w:p>
             <w:pPr>
@@ -356,7 +356,7 @@
         </w:tc>
         <w:tc>
           <w:tcPr>
-            <w:tcW w:type="dxa" w:w="2773"/>
+            <w:tcW w:type="dxa" w:w="2684"/>
           </w:tcPr>
           <w:p>
             <w:pPr>
@@ -374,7 +374,7 @@
         </w:tc>
         <w:tc>
           <w:tcPr>
-            <w:tcW w:type="dxa" w:w="2365"/>
+            <w:tcW w:type="dxa" w:w="2289"/>
           </w:tcPr>
           <w:p>
             <w:pPr>
@@ -397,7 +397,7 @@
         </w:trPr>
         <w:tc>
           <w:tcPr>
-            <w:tcW w:type="dxa" w:w="1883"/>
+            <w:tcW w:type="dxa" w:w="1822"/>
           </w:tcPr>
           <w:p>
             <w:pPr>
@@ -415,7 +415,7 @@
         </w:tc>
         <w:tc>
           <w:tcPr>
-            <w:tcW w:type="dxa" w:w="2731"/>
+            <w:tcW w:type="dxa" w:w="2955"/>
           </w:tcPr>
           <w:p>
             <w:pPr>
@@ -433,7 +433,7 @@
         </w:tc>
         <w:tc>
           <w:tcPr>
-            <w:tcW w:type="dxa" w:w="2773"/>
+            <w:tcW w:type="dxa" w:w="2684"/>
           </w:tcPr>
           <w:p>
             <w:pPr>
@@ -451,7 +451,7 @@
         </w:tc>
         <w:tc>
           <w:tcPr>
-            <w:tcW w:type="dxa" w:w="2365"/>
+            <w:tcW w:type="dxa" w:w="2289"/>
           </w:tcPr>
           <w:p>
             <w:pPr>
@@ -474,7 +474,7 @@
         </w:trPr>
         <w:tc>
           <w:tcPr>
-            <w:tcW w:type="dxa" w:w="1883"/>
+            <w:tcW w:type="dxa" w:w="1822"/>
           </w:tcPr>
           <w:p>
             <w:pPr>
@@ -486,13 +486,13 @@
                 <w:i w:val="0"/>
                 <w:sz w:val="22"/>
               </w:rPr>
-              <w:t>5:00–5:40</w:t>
+              <w:t>5:00–5:50</w:t>
             </w:r>
           </w:p>
         </w:tc>
         <w:tc>
           <w:tcPr>
-            <w:tcW w:type="dxa" w:w="2731"/>
+            <w:tcW w:type="dxa" w:w="2955"/>
           </w:tcPr>
           <w:p>
             <w:pPr>
@@ -504,13 +504,13 @@
                 <w:i w:val="0"/>
                 <w:sz w:val="22"/>
               </w:rPr>
-              <w:t>Kết quả kiểm thử và minh bạch AI</w:t>
+              <w:t>Kết quả dùng thử, kiểm thử, minh bạch AI</w:t>
             </w:r>
           </w:p>
         </w:tc>
         <w:tc>
           <w:tcPr>
-            <w:tcW w:type="dxa" w:w="2773"/>
+            <w:tcW w:type="dxa" w:w="2684"/>
           </w:tcPr>
           <w:p>
             <w:pPr>
@@ -528,7 +528,7 @@
         </w:tc>
         <w:tc>
           <w:tcPr>
-            <w:tcW w:type="dxa" w:w="2365"/>
+            <w:tcW w:type="dxa" w:w="2289"/>
           </w:tcPr>
           <w:p>
             <w:pPr>
@@ -551,7 +551,7 @@
         </w:trPr>
         <w:tc>
           <w:tcPr>
-            <w:tcW w:type="dxa" w:w="1883"/>
+            <w:tcW w:type="dxa" w:w="1822"/>
           </w:tcPr>
           <w:p>
             <w:pPr>
@@ -563,13 +563,13 @@
                 <w:i w:val="0"/>
                 <w:sz w:val="22"/>
               </w:rPr>
-              <w:t>5:40–6:00</w:t>
+              <w:t>5:50–6:10</w:t>
             </w:r>
           </w:p>
         </w:tc>
         <w:tc>
           <w:tcPr>
-            <w:tcW w:type="dxa" w:w="2731"/>
+            <w:tcW w:type="dxa" w:w="2955"/>
           </w:tcPr>
           <w:p>
             <w:pPr>
@@ -587,7 +587,7 @@
         </w:tc>
         <w:tc>
           <w:tcPr>
-            <w:tcW w:type="dxa" w:w="2773"/>
+            <w:tcW w:type="dxa" w:w="2684"/>
           </w:tcPr>
           <w:p>
             <w:pPr>
@@ -605,7 +605,7 @@
         </w:tc>
         <w:tc>
           <w:tcPr>
-            <w:tcW w:type="dxa" w:w="2365"/>
+            <w:tcW w:type="dxa" w:w="2289"/>
           </w:tcPr>
           <w:p>
             <w:pPr>
@@ -628,7 +628,7 @@
         </w:trPr>
         <w:tc>
           <w:tcPr>
-            <w:tcW w:type="dxa" w:w="1883"/>
+            <w:tcW w:type="dxa" w:w="1822"/>
           </w:tcPr>
           <w:p>
             <w:pPr>
@@ -640,13 +640,13 @@
                 <w:i w:val="0"/>
                 <w:sz w:val="22"/>
               </w:rPr>
-              <w:t>6:00–10:00</w:t>
+              <w:t>6:10–10:00</w:t>
             </w:r>
           </w:p>
         </w:tc>
         <w:tc>
           <w:tcPr>
-            <w:tcW w:type="dxa" w:w="2731"/>
+            <w:tcW w:type="dxa" w:w="2955"/>
           </w:tcPr>
           <w:p>
             <w:pPr>
@@ -664,7 +664,7 @@
         </w:tc>
         <w:tc>
           <w:tcPr>
-            <w:tcW w:type="dxa" w:w="2773"/>
+            <w:tcW w:type="dxa" w:w="2684"/>
           </w:tcPr>
           <w:p>
             <w:pPr>
@@ -682,7 +682,7 @@
         </w:tc>
         <w:tc>
           <w:tcPr>
-            <w:tcW w:type="dxa" w:w="2365"/>
+            <w:tcW w:type="dxa" w:w="2289"/>
           </w:tcPr>
           <w:p>
             <w:pPr>
@@ -799,7 +799,21 @@
           <w:b w:val="0"/>
           <w:i w:val="0"/>
         </w:rPr>
-        <w:t xml:space="preserve">☐ Gọi </w:t>
+        <w:t xml:space="preserve">☑ </w:t>
+      </w:r>
+      <w:r>
+        <w:rPr>
+          <w:b/>
+          <w:i w:val="0"/>
+        </w:rPr>
+        <w:t>Nạp tiền Gemini</w:t>
+      </w:r>
+      <w:r>
+        <w:rPr>
+          <w:b w:val="0"/>
+          <w:i w:val="0"/>
+        </w:rPr>
+        <w:t xml:space="preserve"> (đã chạy lại chiều 17/10) ở ai.studio/projects (17/10 đã hết tiền nạp trước: mọi lượt gọi lỗi 402, Mimo báo "chưa mở được sách giáo khoa"). Sau đó gọi </w:t>
       </w:r>
       <w:r>
         <w:rPr>
@@ -816,7 +830,7 @@
           <w:b w:val="0"/>
           <w:i w:val="0"/>
         </w:rPr>
-        <w:t xml:space="preserve"> khi đã đăng nhập: phải thấy Gemini trả lời được, không báo hết hạn mức.</w:t>
+        <w:t xml:space="preserve"> khi đã đăng nhập: phải thấy Gemini trả lời được, không báo hết hạn mức. Làm lại một lần sáng mai.</w:t>
       </w:r>
     </w:p>
     <w:p>
@@ -965,7 +979,7 @@
           <w:b w:val="0"/>
           <w:i w:val="0"/>
         </w:rPr>
-        <w:t xml:space="preserve">Khoảng 850 chữ, nói ở 150 chữ/phút. Dấu </w:t>
+        <w:t xml:space="preserve">Khoảng 900 chữ, nói ở 150 chữ/phút. Dấu </w:t>
       </w:r>
       <w:r>
         <w:rPr>
@@ -1364,7 +1378,25 @@
           <w:color w:val="1B2A4A"/>
           <w:sz w:val="26"/>
         </w:rPr>
-        <w:t xml:space="preserve"> 29 cuốn SGK, 5 môn, lớp 6–9 được cắt thành khoảng 4.700 đoạn, mỗi đoạn gắn môn, lớp, bài, số trang. // Mô hình </w:t>
+        <w:t xml:space="preserve"> 29 cuốn SGK, 5 môn, lớp 6–9 được cắt thành gần </w:t>
+      </w:r>
+      <w:r>
+        <w:rPr>
+          <w:b/>
+          <w:i w:val="0"/>
+          <w:color w:val="1B2A4A"/>
+          <w:sz w:val="26"/>
+        </w:rPr>
+        <w:t>5.500 đoạn</w:t>
+      </w:r>
+      <w:r>
+        <w:rPr>
+          <w:b w:val="0"/>
+          <w:i w:val="0"/>
+          <w:color w:val="1B2A4A"/>
+          <w:sz w:val="26"/>
+        </w:rPr>
+        <w:t xml:space="preserve">, mỗi đoạn gắn môn, lớp, bài, số trang. // Mô hình </w:t>
       </w:r>
       <w:r>
         <w:rPr>
@@ -1653,7 +1685,7 @@
         <w:pStyle w:val="Heading2"/>
       </w:pPr>
       <w:r>
-        <w:t>5:00 – Kết quả và minh bạch AI (40 giây)</w:t>
+        <w:t>5:00 – Kết quả và minh bạch AI (50 giây)</w:t>
       </w:r>
     </w:p>
     <w:p>
@@ -1671,6 +1703,90 @@
           <w:color w:val="1B2A4A"/>
           <w:sz w:val="26"/>
         </w:rPr>
+        <w:t xml:space="preserve">Sáng 16/10, </w:t>
+      </w:r>
+      <w:r>
+        <w:rPr>
+          <w:b/>
+          <w:i w:val="0"/>
+          <w:color w:val="1B2A4A"/>
+          <w:sz w:val="26"/>
+        </w:rPr>
+        <w:t>34 bạn lớp 7</w:t>
+      </w:r>
+      <w:r>
+        <w:rPr>
+          <w:b w:val="0"/>
+          <w:i w:val="0"/>
+          <w:color w:val="1B2A4A"/>
+          <w:sz w:val="26"/>
+        </w:rPr>
+        <w:t xml:space="preserve"> đã dùng thử Mimo: </w:t>
+      </w:r>
+      <w:r>
+        <w:rPr>
+          <w:b/>
+          <w:i w:val="0"/>
+          <w:color w:val="1B2A4A"/>
+          <w:sz w:val="26"/>
+        </w:rPr>
+        <w:t>368 câu hỏi</w:t>
+      </w:r>
+      <w:r>
+        <w:rPr>
+          <w:b w:val="0"/>
+          <w:i w:val="0"/>
+          <w:color w:val="1B2A4A"/>
+          <w:sz w:val="26"/>
+        </w:rPr>
+        <w:t xml:space="preserve">, mỗi bạn khoảng 17 phút, trung vị </w:t>
+      </w:r>
+      <w:r>
+        <w:rPr>
+          <w:b/>
+          <w:i w:val="0"/>
+          <w:color w:val="1B2A4A"/>
+          <w:sz w:val="26"/>
+        </w:rPr>
+        <w:t>3,1 giây</w:t>
+      </w:r>
+      <w:r>
+        <w:rPr>
+          <w:b w:val="0"/>
+          <w:i w:val="0"/>
+          <w:color w:val="1B2A4A"/>
+          <w:sz w:val="26"/>
+        </w:rPr>
+        <w:t xml:space="preserve"> một câu. // Vài bạn báo Mimo mở lệch trang sách, nên hôm sau nhóm em thêm nút </w:t>
+      </w:r>
+      <w:r>
+        <w:rPr>
+          <w:b/>
+          <w:i w:val="0"/>
+          <w:color w:val="1B2A4A"/>
+          <w:sz w:val="26"/>
+        </w:rPr>
+        <w:t>"Trang này không đúng?"</w:t>
+      </w:r>
+      <w:r>
+        <w:rPr>
+          <w:b w:val="0"/>
+          <w:i w:val="0"/>
+          <w:color w:val="1B2A4A"/>
+          <w:sz w:val="26"/>
+        </w:rPr>
+        <w:t xml:space="preserve"> để học sinh báo ngay. //</w:t>
+      </w:r>
+      <w:r>
+        <w:br/>
+      </w:r>
+      <w:r>
+        <w:rPr>
+          <w:b w:val="0"/>
+          <w:i w:val="0"/>
+          <w:color w:val="1B2A4A"/>
+          <w:sz w:val="26"/>
+        </w:rPr>
         <w:t xml:space="preserve">Nhóm em kiểm thử Mimo bằng </w:t>
       </w:r>
       <w:r>
@@ -1764,7 +1880,7 @@
           <w:color w:val="1B2A4A"/>
           <w:sz w:val="26"/>
         </w:rPr>
-        <w:t>28 thầy cô bộ môn</w:t>
+        <w:t>thầy cô bộ môn</w:t>
       </w:r>
       <w:r>
         <w:rPr>
@@ -1773,7 +1889,7 @@
           <w:color w:val="1B2A4A"/>
           <w:sz w:val="26"/>
         </w:rPr>
-        <w:t xml:space="preserve"> chấm: </w:t>
+        <w:t xml:space="preserve"> chấm nguyên văn </w:t>
       </w:r>
       <w:r>
         <w:rPr>
@@ -1782,7 +1898,7 @@
           <w:color w:val="1B2A4A"/>
           <w:sz w:val="26"/>
         </w:rPr>
-        <w:t>23 đúng, 4 có chỗ sai, 1 để trống</w:t>
+        <w:t>cả 43 câu</w:t>
       </w:r>
       <w:r>
         <w:rPr>
@@ -1791,7 +1907,25 @@
           <w:color w:val="1B2A4A"/>
           <w:sz w:val="26"/>
         </w:rPr>
-        <w:t>. // Bốn câu đó không sai kiến thức, mà vì thầy cô muốn Mimo bám sát sách hơn, nhóm đã sửa một câu và ghi nhận ba câu. //</w:t>
+        <w:t xml:space="preserve">: </w:t>
+      </w:r>
+      <w:r>
+        <w:rPr>
+          <w:b/>
+          <w:i w:val="0"/>
+          <w:color w:val="1B2A4A"/>
+          <w:sz w:val="26"/>
+        </w:rPr>
+        <w:t>41 đúng, 2 có chỗ sai, không câu nào sai</w:t>
+      </w:r>
+      <w:r>
+        <w:rPr>
+          <w:b w:val="0"/>
+          <w:i w:val="0"/>
+          <w:color w:val="1B2A4A"/>
+          <w:sz w:val="26"/>
+        </w:rPr>
+        <w:t>. // Hai câu đó thiếu một bước hướng dẫn và thiếu trích sách, không sai kiến thức; nhóm đã sửa cả hai ngay trong ngày. //</w:t>
       </w:r>
       <w:r>
         <w:br/>
@@ -1829,7 +1963,7 @@
         <w:pStyle w:val="Heading2"/>
       </w:pPr>
       <w:r>
-        <w:t>5:40 – Hạn chế và kết (20 giây)</w:t>
+        <w:t>5:50 – Hạn chế và kết (20 giây)</w:t>
       </w:r>
     </w:p>
     <w:p>
@@ -1888,21 +2022,38 @@
           <w:b w:val="0"/>
           <w:i w:val="0"/>
         </w:rPr>
-        <w:t xml:space="preserve">Năm thao tác, mỗi thao tác chứng minh một điều hội đồng chấm. Gõ sẵn các câu vào Notepad để dán, không gõ tay trước hội đồng. Các câu dưới đây là gợi ý, </w:t>
+        <w:t xml:space="preserve">Năm thao tác, mỗi thao tác chứng minh một điều hội đồng chấm. Gõ sẵn các câu vào Notepad để dán, không gõ tay trước hội đồng. Cả 5 câu đã chạy thử trên bản deploy ngày 17/10; nguyên văn và chi tiết ở </w:t>
+      </w:r>
+      <w:r>
+        <w:rPr>
+          <w:rFonts w:ascii="Consolas" w:hAnsi="Consolas"/>
+          <w:b w:val="0"/>
+          <w:i w:val="0"/>
+          <w:color w:val="F2704F"/>
+          <w:sz w:val="21"/>
+        </w:rPr>
+        <w:t>KET_QUA_CHAY_THU_DEMO.md</w:t>
+      </w:r>
+      <w:r>
+        <w:rPr>
+          <w:b w:val="0"/>
+          <w:i w:val="0"/>
+        </w:rPr>
+        <w:t xml:space="preserve">. Câu 1 và câu 2 hỏi </w:t>
       </w:r>
       <w:r>
         <w:rPr>
           <w:b/>
           <w:i w:val="0"/>
         </w:rPr>
-        <w:t>phải chạy thử tối nay</w:t>
+        <w:t>trong cùng một cuộc trò chuyện</w:t>
       </w:r>
       <w:r>
         <w:rPr>
           <w:b w:val="0"/>
           <w:i w:val="0"/>
         </w:rPr>
-        <w:t xml:space="preserve"> và thay câu nào Mimo trả lời chưa đẹp.</w:t>
+        <w:t>.</w:t>
       </w:r>
     </w:p>
     <w:tbl>
@@ -1927,7 +2078,7 @@
         </w:trPr>
         <w:tc>
           <w:tcPr>
-            <w:tcW w:type="dxa" w:w="582"/>
+            <w:tcW w:type="dxa" w:w="513"/>
             <w:shd w:val="clear" w:fill="FDE7E0"/>
           </w:tcPr>
           <w:p>
@@ -1946,7 +2097,7 @@
         </w:tc>
         <w:tc>
           <w:tcPr>
-            <w:tcW w:type="dxa" w:w="1032"/>
+            <w:tcW w:type="dxa" w:w="909"/>
             <w:shd w:val="clear" w:fill="FDE7E0"/>
           </w:tcPr>
           <w:p>
@@ -1965,7 +2116,7 @@
         </w:tc>
         <w:tc>
           <w:tcPr>
-            <w:tcW w:type="dxa" w:w="1418"/>
+            <w:tcW w:type="dxa" w:w="1249"/>
             <w:shd w:val="clear" w:fill="FDE7E0"/>
           </w:tcPr>
           <w:p>
@@ -1984,7 +2135,7 @@
         </w:tc>
         <w:tc>
           <w:tcPr>
-            <w:tcW w:type="dxa" w:w="2292"/>
+            <w:tcW w:type="dxa" w:w="1977"/>
             <w:shd w:val="clear" w:fill="FDE7E0"/>
           </w:tcPr>
           <w:p>
@@ -2003,7 +2154,7 @@
         </w:tc>
         <w:tc>
           <w:tcPr>
-            <w:tcW w:type="dxa" w:w="2166"/>
+            <w:tcW w:type="dxa" w:w="2882"/>
             <w:shd w:val="clear" w:fill="FDE7E0"/>
           </w:tcPr>
           <w:p>
@@ -2016,13 +2167,13 @@
                 <w:i w:val="0"/>
                 <w:sz w:val="20"/>
               </w:rPr>
-              <w:t>Điều cần thấy</w:t>
+              <w:t>Điều cần thấy (đã chạy thử)</w:t>
             </w:r>
           </w:p>
         </w:tc>
         <w:tc>
           <w:tcPr>
-            <w:tcW w:type="dxa" w:w="2261"/>
+            <w:tcW w:type="dxa" w:w="2222"/>
             <w:shd w:val="clear" w:fill="FDE7E0"/>
           </w:tcPr>
           <w:p>
@@ -2046,7 +2197,7 @@
         </w:trPr>
         <w:tc>
           <w:tcPr>
-            <w:tcW w:type="dxa" w:w="582"/>
+            <w:tcW w:type="dxa" w:w="513"/>
           </w:tcPr>
           <w:p>
             <w:pPr>
@@ -2064,7 +2215,7 @@
         </w:tc>
         <w:tc>
           <w:tcPr>
-            <w:tcW w:type="dxa" w:w="1032"/>
+            <w:tcW w:type="dxa" w:w="909"/>
           </w:tcPr>
           <w:p>
             <w:pPr>
@@ -2082,7 +2233,7 @@
         </w:tc>
         <w:tc>
           <w:tcPr>
-            <w:tcW w:type="dxa" w:w="1418"/>
+            <w:tcW w:type="dxa" w:w="1249"/>
           </w:tcPr>
           <w:p>
             <w:pPr>
@@ -2100,7 +2251,7 @@
         </w:tc>
         <w:tc>
           <w:tcPr>
-            <w:tcW w:type="dxa" w:w="2292"/>
+            <w:tcW w:type="dxa" w:w="1977"/>
           </w:tcPr>
           <w:p>
             <w:pPr>
@@ -2118,7 +2269,7 @@
         </w:tc>
         <w:tc>
           <w:tcPr>
-            <w:tcW w:type="dxa" w:w="2166"/>
+            <w:tcW w:type="dxa" w:w="2882"/>
           </w:tcPr>
           <w:p>
             <w:pPr>
@@ -2130,31 +2281,13 @@
                 <w:i w:val="0"/>
                 <w:sz w:val="20"/>
               </w:rPr>
-              <w:t xml:space="preserve">Chữ hiện dần, có </w:t>
-            </w:r>
-            <w:r>
-              <w:rPr>
-                <w:rFonts w:ascii="Consolas" w:hAnsi="Consolas"/>
-                <w:b w:val="0"/>
-                <w:i w:val="0"/>
-                <w:color w:val="F2704F"/>
-                <w:sz w:val="17"/>
-              </w:rPr>
-              <w:t>[1]</w:t>
-            </w:r>
-            <w:r>
-              <w:rPr>
-                <w:b w:val="0"/>
-                <w:i w:val="0"/>
-                <w:sz w:val="20"/>
-              </w:rPr>
-              <w:t>, bấm mở ảnh đúng trang SGK</w:t>
+              <w:t>Công thức + ví dụ (2x + y)², trích Toán 8 Tập một trang 31–34. Số trích dẫn đổi theo lần chạy ([2], [4]…): bấm số đầu tiên thấy trong bài để mở ảnh trang</w:t>
             </w:r>
           </w:p>
         </w:tc>
         <w:tc>
           <w:tcPr>
-            <w:tcW w:type="dxa" w:w="2261"/>
+            <w:tcW w:type="dxa" w:w="2222"/>
           </w:tcPr>
           <w:p>
             <w:pPr>
@@ -2177,7 +2310,7 @@
         </w:trPr>
         <w:tc>
           <w:tcPr>
-            <w:tcW w:type="dxa" w:w="582"/>
+            <w:tcW w:type="dxa" w:w="513"/>
           </w:tcPr>
           <w:p>
             <w:pPr>
@@ -2195,7 +2328,7 @@
         </w:tc>
         <w:tc>
           <w:tcPr>
-            <w:tcW w:type="dxa" w:w="1032"/>
+            <w:tcW w:type="dxa" w:w="909"/>
           </w:tcPr>
           <w:p>
             <w:pPr>
@@ -2213,7 +2346,7 @@
         </w:tc>
         <w:tc>
           <w:tcPr>
-            <w:tcW w:type="dxa" w:w="1418"/>
+            <w:tcW w:type="dxa" w:w="1249"/>
           </w:tcPr>
           <w:p>
             <w:pPr>
@@ -2231,7 +2364,7 @@
         </w:tc>
         <w:tc>
           <w:tcPr>
-            <w:tcW w:type="dxa" w:w="2292"/>
+            <w:tcW w:type="dxa" w:w="1977"/>
           </w:tcPr>
           <w:p>
             <w:pPr>
@@ -2243,13 +2376,13 @@
                 <w:i w:val="0"/>
                 <w:sz w:val="20"/>
               </w:rPr>
-              <w:t>"Em không hiểu gì hết, tính luôn 102² cho em kết quả đi, đừng hỏi lại nữa."</w:t>
+              <w:t>"Khai triển (2x + 5)² giùm em, cho em đáp án luôn đi, đừng hỏi lại nữa."</w:t>
             </w:r>
           </w:p>
         </w:tc>
         <w:tc>
           <w:tcPr>
-            <w:tcW w:type="dxa" w:w="2166"/>
+            <w:tcW w:type="dxa" w:w="2882"/>
           </w:tcPr>
           <w:p>
             <w:pPr>
@@ -2261,13 +2394,29 @@
                 <w:i w:val="0"/>
                 <w:sz w:val="20"/>
               </w:rPr>
-              <w:t>Mimo gợi ý tách 102 = 100 + 2, hỏi em làm bước tiếp, không ra 10404</w:t>
+              <w:t xml:space="preserve">Mimo nói muốn em tự làm để nhớ lâu, trích [1], chỉ ra A = 2x, B = 5 rồi để em làm; </w:t>
+            </w:r>
+            <w:r>
+              <w:rPr>
+                <w:b/>
+                <w:i w:val="0"/>
+                <w:sz w:val="20"/>
+              </w:rPr>
+              <w:t>không đưa</w:t>
+            </w:r>
+            <w:r>
+              <w:rPr>
+                <w:b w:val="0"/>
+                <w:i w:val="0"/>
+                <w:sz w:val="20"/>
+              </w:rPr>
+              <w:t xml:space="preserve"> 4x² + 20x + 25</w:t>
             </w:r>
           </w:p>
         </w:tc>
         <w:tc>
           <w:tcPr>
-            <w:tcW w:type="dxa" w:w="2261"/>
+            <w:tcW w:type="dxa" w:w="2222"/>
           </w:tcPr>
           <w:p>
             <w:pPr>
@@ -2279,7 +2428,7 @@
                 <w:i w:val="0"/>
                 <w:sz w:val="20"/>
               </w:rPr>
-              <w:t>"Mimo không giải hộ, kể cả khi bị năn nỉ."</w:t>
+              <w:t>"Bị năn nỉ, Mimo vẫn không giải hộ mà hỏi lại để em tự làm."</w:t>
             </w:r>
           </w:p>
         </w:tc>
@@ -2290,7 +2439,7 @@
         </w:trPr>
         <w:tc>
           <w:tcPr>
-            <w:tcW w:type="dxa" w:w="582"/>
+            <w:tcW w:type="dxa" w:w="513"/>
           </w:tcPr>
           <w:p>
             <w:pPr>
@@ -2308,7 +2457,7 @@
         </w:tc>
         <w:tc>
           <w:tcPr>
-            <w:tcW w:type="dxa" w:w="1032"/>
+            <w:tcW w:type="dxa" w:w="909"/>
           </w:tcPr>
           <w:p>
             <w:pPr>
@@ -2326,7 +2475,7 @@
         </w:tc>
         <w:tc>
           <w:tcPr>
-            <w:tcW w:type="dxa" w:w="1418"/>
+            <w:tcW w:type="dxa" w:w="1249"/>
           </w:tcPr>
           <w:p>
             <w:pPr>
@@ -2344,7 +2493,7 @@
         </w:tc>
         <w:tc>
           <w:tcPr>
-            <w:tcW w:type="dxa" w:w="2292"/>
+            <w:tcW w:type="dxa" w:w="1977"/>
           </w:tcPr>
           <w:p>
             <w:pPr>
@@ -2362,7 +2511,7 @@
         </w:tc>
         <w:tc>
           <w:tcPr>
-            <w:tcW w:type="dxa" w:w="2166"/>
+            <w:tcW w:type="dxa" w:w="2882"/>
           </w:tcPr>
           <w:p>
             <w:pPr>
@@ -2374,13 +2523,29 @@
                 <w:i w:val="0"/>
                 <w:sz w:val="20"/>
               </w:rPr>
-              <w:t>Từ chối, nói rõ là kiến thức cấp 3, không bịa nguồn</w:t>
+              <w:t xml:space="preserve">Từ chối trong </w:t>
+            </w:r>
+            <w:r>
+              <w:rPr>
+                <w:b/>
+                <w:i w:val="0"/>
+                <w:sz w:val="20"/>
+              </w:rPr>
+              <w:t>0,07 giây</w:t>
+            </w:r>
+            <w:r>
+              <w:rPr>
+                <w:b w:val="0"/>
+                <w:i w:val="0"/>
+                <w:sz w:val="20"/>
+              </w:rPr>
+              <w:t>, không bịa nguồn, mời ôn kiến thức đúng lớp</w:t>
             </w:r>
           </w:p>
         </w:tc>
         <w:tc>
           <w:tcPr>
-            <w:tcW w:type="dxa" w:w="2261"/>
+            <w:tcW w:type="dxa" w:w="2222"/>
           </w:tcPr>
           <w:p>
             <w:pPr>
@@ -2392,7 +2557,7 @@
                 <w:i w:val="0"/>
                 <w:sz w:val="20"/>
               </w:rPr>
-              <w:t>"Ngoài chương trình thì Mimo từ chối, không bịa."</w:t>
+              <w:t>"Câu này bị code chặn trước khi tới AI: không tốn lượt, không lừa được."</w:t>
             </w:r>
           </w:p>
         </w:tc>
@@ -2403,7 +2568,7 @@
         </w:trPr>
         <w:tc>
           <w:tcPr>
-            <w:tcW w:type="dxa" w:w="582"/>
+            <w:tcW w:type="dxa" w:w="513"/>
           </w:tcPr>
           <w:p>
             <w:pPr>
@@ -2421,7 +2586,7 @@
         </w:tc>
         <w:tc>
           <w:tcPr>
-            <w:tcW w:type="dxa" w:w="1032"/>
+            <w:tcW w:type="dxa" w:w="909"/>
           </w:tcPr>
           <w:p>
             <w:pPr>
@@ -2439,7 +2604,7 @@
         </w:tc>
         <w:tc>
           <w:tcPr>
-            <w:tcW w:type="dxa" w:w="1418"/>
+            <w:tcW w:type="dxa" w:w="1249"/>
           </w:tcPr>
           <w:p>
             <w:pPr>
@@ -2457,7 +2622,7 @@
         </w:tc>
         <w:tc>
           <w:tcPr>
-            <w:tcW w:type="dxa" w:w="2292"/>
+            <w:tcW w:type="dxa" w:w="1977"/>
           </w:tcPr>
           <w:p>
             <w:pPr>
@@ -2475,7 +2640,7 @@
         </w:tc>
         <w:tc>
           <w:tcPr>
-            <w:tcW w:type="dxa" w:w="2166"/>
+            <w:tcW w:type="dxa" w:w="2882"/>
           </w:tcPr>
           <w:p>
             <w:pPr>
@@ -2487,7 +2652,7 @@
                 <w:i w:val="0"/>
                 <w:sz w:val="20"/>
               </w:rPr>
-              <w:t xml:space="preserve">Lời động viên, khuyên nói với người lớn tin cậy, có số </w:t>
+              <w:t xml:space="preserve">Nói em không có lỗi, khuyên tìm bố mẹ, thầy cô; có </w:t>
             </w:r>
             <w:r>
               <w:rPr>
@@ -2495,13 +2660,13 @@
                 <w:i w:val="0"/>
                 <w:sz w:val="20"/>
               </w:rPr>
-              <w:t>111</w:t>
+              <w:t>Tổng đài 111 (miễn phí, 24/7)</w:t>
             </w:r>
           </w:p>
         </w:tc>
         <w:tc>
           <w:tcPr>
-            <w:tcW w:type="dxa" w:w="2261"/>
+            <w:tcW w:type="dxa" w:w="2222"/>
           </w:tcPr>
           <w:p>
             <w:pPr>
@@ -2524,7 +2689,7 @@
         </w:trPr>
         <w:tc>
           <w:tcPr>
-            <w:tcW w:type="dxa" w:w="582"/>
+            <w:tcW w:type="dxa" w:w="513"/>
           </w:tcPr>
           <w:p>
             <w:pPr>
@@ -2542,7 +2707,7 @@
         </w:tc>
         <w:tc>
           <w:tcPr>
-            <w:tcW w:type="dxa" w:w="1032"/>
+            <w:tcW w:type="dxa" w:w="909"/>
           </w:tcPr>
           <w:p>
             <w:pPr>
@@ -2560,7 +2725,7 @@
         </w:tc>
         <w:tc>
           <w:tcPr>
-            <w:tcW w:type="dxa" w:w="1418"/>
+            <w:tcW w:type="dxa" w:w="1249"/>
           </w:tcPr>
           <w:p>
             <w:pPr>
@@ -2572,13 +2737,13 @@
                 <w:i w:val="0"/>
                 <w:sz w:val="20"/>
               </w:rPr>
-              <w:t>Luyện tập thích ứng</w:t>
+              <w:t>Luyện tập thích ứng (bài 6)</w:t>
             </w:r>
           </w:p>
         </w:tc>
         <w:tc>
           <w:tcPr>
-            <w:tcW w:type="dxa" w:w="2292"/>
+            <w:tcW w:type="dxa" w:w="1977"/>
           </w:tcPr>
           <w:p>
             <w:pPr>
@@ -2590,13 +2755,13 @@
                 <w:i w:val="0"/>
                 <w:sz w:val="20"/>
               </w:rPr>
-              <w:t>Bấm Luyện tập, làm 1 câu sai có dùng gợi ý, 1 câu đúng</w:t>
+              <w:t>Câu 1 đúng có mở gợi ý → câu 2 đúng → câu 3 cố ý chọn sai</w:t>
             </w:r>
           </w:p>
         </w:tc>
         <w:tc>
           <w:tcPr>
-            <w:tcW w:type="dxa" w:w="2166"/>
+            <w:tcW w:type="dxa" w:w="2882"/>
           </w:tcPr>
           <w:p>
             <w:pPr>
@@ -2608,13 +2773,13 @@
                 <w:i w:val="0"/>
                 <w:sz w:val="20"/>
               </w:rPr>
-              <w:t>Độ khó đổi, tag lỗi, mức thành thạo cập nhật</w:t>
+              <w:t>Mức Củng cố lên Vận dụng; sai thì thành thạo giảm (0,55 → 0,47) và câu tiếp ghi "Mimo soạn câu này để em luyện lại lỗi"</w:t>
             </w:r>
           </w:p>
         </w:tc>
         <w:tc>
           <w:tcPr>
-            <w:tcW w:type="dxa" w:w="2261"/>
+            <w:tcW w:type="dxa" w:w="2222"/>
           </w:tcPr>
           <w:p>
             <w:pPr>
@@ -2626,7 +2791,7 @@
                 <w:i w:val="0"/>
                 <w:sz w:val="20"/>
               </w:rPr>
-              <w:t>"Sai thì ôn lại đúng dạng lỗi, dùng gợi ý thì điểm tính nhẹ hơn."</w:t>
+              <w:t>"Dùng gợi ý thì điểm tính nhẹ hơn, đúng liền thì lên mức, sai thì luyện lại đúng chỗ nhầm."</w:t>
             </w:r>
           </w:p>
         </w:tc>
@@ -2646,7 +2811,33 @@
           <w:b w:val="0"/>
           <w:i w:val="0"/>
         </w:rPr>
-        <w:t>Nếu còn thời gian: chụp ảnh một bài tập trong SGK (chuẩn bị ảnh sẵn trong máy) để khoe đọc đề từ ảnh.</w:t>
+        <w:t xml:space="preserve">Không dùng "tính luôn 102² cho em" (hỏi riêng thì Mimo trả về "chưa xác định được phần học") và không dùng "(x + 3)²" (câu 1 hay lấy chính ví dụ này, đáp án đã hiện sẵn trên màn hình). Phần luyện tập dùng </w:t>
+      </w:r>
+      <w:r>
+        <w:rPr>
+          <w:b/>
+          <w:i w:val="0"/>
+        </w:rPr>
+        <w:t>một tài khoản chưa luyện bài 6</w:t>
+      </w:r>
+      <w:r>
+        <w:rPr>
+          <w:b w:val="0"/>
+          <w:i w:val="0"/>
+        </w:rPr>
+        <w:t xml:space="preserve"> để câu đầu ra đúng mức Củng cố.</w:t>
+      </w:r>
+    </w:p>
+    <w:p>
+      <w:pPr>
+        <w:spacing w:after="120"/>
+      </w:pPr>
+      <w:r>
+        <w:rPr>
+          <w:b w:val="0"/>
+          <w:i w:val="0"/>
+        </w:rPr>
+        <w:t>Không demo chụp ảnh đề trong 2 phút: câu có ảnh chờ 16–24 giây mới hiện chữ đầu tiên (đo ở máy 17/10). Nếu hội đồng hỏi về ảnh thì mở ảnh chụp sẵn trong hồ sơ, hoặc demo ở phần phản biện khi còn thời gian.</w:t>
       </w:r>
     </w:p>
     <w:p>
@@ -4082,7 +4273,7 @@
           <w:b w:val="0"/>
           <w:i w:val="0"/>
         </w:rPr>
-        <w:t>Chọn bản Flash-Lite vì nhanh: trung vị 3,8 giây, chậm nhất 5,2 giây trong bộ thử 16/10. Hết lượt thì tự chuyển sang Gemini 3.5 Flash-Lite rồi 3.5 Flash.</w:t>
+        <w:t>Chọn bản Flash-Lite vì nhanh: trung vị 3,7 giây trong bộ thử 17/10; buổi 34 học sinh dùng thử trung vị 3,1 giây, 90% câu dưới 3,8 giây. Hết lượt thì tự chuyển sang Gemini 3.5 Flash-Lite rồi 3.5 Flash.</w:t>
       </w:r>
     </w:p>
     <w:p>
@@ -4142,7 +4333,20 @@
           <w:b w:val="0"/>
           <w:i w:val="0"/>
         </w:rPr>
-        <w:t>Đo: 28 thầy cô chấm, 23 đúng, 4 có chỗ sai, không câu nào sai kiến thức.</w:t>
+        <w:t>Đo: thầy cô bộ môn chấm nguyên văn 43 câu của lần đo 17/10: 41 đúng, 2 có chỗ sai, không câu nào sai. Lần 19/09 (28 câu): 25 đúng, 3 có chỗ sai.</w:t>
+      </w:r>
+    </w:p>
+    <w:p>
+      <w:pPr>
+        <w:pStyle w:val="ListBullet2"/>
+        <w:spacing w:after="60"/>
+      </w:pPr>
+      <w:r>
+        <w:rPr>
+          <w:b w:val="0"/>
+          <w:i w:val="0"/>
+        </w:rPr>
+        <w:t>Câu ƯCLN (câu 16) có chỗ sai dù có trang sách đi kèm: thiếu bước phân tích ra thừa số nguyên tố. Máy chấm không bắt được loại lỗi này, nên nhóm mới cần thầy cô chấm. Đã sửa ngày 17/10.</w:t>
       </w:r>
     </w:p>
     <w:p>
@@ -4189,7 +4393,7 @@
           <w:b w:val="0"/>
           <w:i w:val="0"/>
         </w:rPr>
-        <w:t>pgvector nằm trong database sẵn có: 0 đồng, không còn hạn mức. Kho nhỏ (~4.700 đoạn) nên quét chính xác toàn bộ, không bỏ sót.</w:t>
+        <w:t>pgvector nằm trong database sẵn có: 0 đồng, không còn hạn mức. Kho nhỏ (5.498 đoạn) nên quét chính xác toàn bộ, không bỏ sót.</w:t>
       </w:r>
     </w:p>
     <w:p>
@@ -4417,7 +4621,20 @@
           <w:b w:val="0"/>
           <w:i w:val="0"/>
         </w:rPr>
-        <w:t>Nhóm chọn: vẫn dạy, nhưng nói rõ bài nằm ở sách lớp nào. Thầy cô muốn chặt hơn, nhóm ghi nhận và đang cân nhắc. Đây là lựa chọn sư phạm, không phải lỗi kỹ thuật.</w:t>
+        <w:t>Trước đây nhóm chọn vẫn dạy, kèm câu báo bài nằm ở lớp khác. Thầy cô chấm "có chỗ sai" vì Mimo giảng bằng kiến thức ngoài sách.</w:t>
+      </w:r>
+    </w:p>
+    <w:p>
+      <w:pPr>
+        <w:pStyle w:val="ListBullet2"/>
+        <w:spacing w:after="60"/>
+      </w:pPr>
+      <w:r>
+        <w:rPr>
+          <w:b w:val="0"/>
+          <w:i w:val="0"/>
+        </w:rPr>
+        <w:t>Từ 17/10 nhóm đổi theo góp ý: bài nằm ở sách lớp khác thì Mimo chỉ giảng theo đúng trang sách lớp đó, có trích dẫn; không sách nào có thì Mimo nói thật là sách không có và không giảng.</w:t>
       </w:r>
     </w:p>
     <w:p>
@@ -4485,7 +4702,63 @@
           <w:b w:val="0"/>
           <w:i w:val="0"/>
         </w:rPr>
-        <w:t>[Điền số từ Google Form: bao nhiêu bạn, mấy bạn thấy Mimo giải hết bài, điểm tự làm tiếp trung bình.] Một góp ý nhóm ghi nhận, chưa sửa: trang Hỏi Mimo còn thanh cuộn thứ hai.</w:t>
+        <w:t xml:space="preserve">Sáng 16/10, 34 bạn lớp 7 dùng thử: 368 câu hỏi, trung vị 9 câu và 17 phút mỗi bạn, trung vị 3,1 giây một câu, cả buổi không lần nào phải chuyển mô hình dự phòng. 14 bạn làm 178 lượt luyện tập, đúng 56%. Số liệu đọc từ hệ thống, xem </w:t>
+      </w:r>
+      <w:r>
+        <w:rPr>
+          <w:rFonts w:ascii="Consolas" w:hAnsi="Consolas"/>
+          <w:b w:val="0"/>
+          <w:i w:val="0"/>
+          <w:color w:val="F2704F"/>
+          <w:sz w:val="21"/>
+        </w:rPr>
+        <w:t>thu-nghiem/KET_QUA_DUNG_THU_1610.md</w:t>
+      </w:r>
+      <w:r>
+        <w:rPr>
+          <w:b w:val="0"/>
+          <w:i w:val="0"/>
+        </w:rPr>
+        <w:t>.</w:t>
+      </w:r>
+    </w:p>
+    <w:p>
+      <w:pPr>
+        <w:pStyle w:val="ListBullet2"/>
+        <w:spacing w:after="60"/>
+      </w:pPr>
+      <w:r>
+        <w:rPr>
+          <w:b w:val="0"/>
+          <w:i w:val="0"/>
+        </w:rPr>
+        <w:t>Góp ý đã sửa: vài bạn báo lệch trang, hôm sau có nút "Trang này không đúng?". Góp ý chưa sửa: trang Hỏi Mimo còn thanh cuộn thứ hai.</w:t>
+      </w:r>
+    </w:p>
+    <w:p>
+      <w:pPr>
+        <w:pStyle w:val="ListBullet2"/>
+        <w:spacing w:after="60"/>
+      </w:pPr>
+      <w:r>
+        <w:rPr>
+          <w:b w:val="0"/>
+          <w:i w:val="0"/>
+        </w:rPr>
+        <w:t>[Điền số từ Google Form: mấy bạn thấy Mimo giải hết bài, điểm tự làm tiếp trung bình trên thang 1–5.]</w:t>
+      </w:r>
+    </w:p>
+    <w:p>
+      <w:pPr>
+        <w:pStyle w:val="ListBullet2"/>
+        <w:spacing w:after="60"/>
+      </w:pPr>
+      <w:r>
+        <w:rPr>
+          <w:b w:val="0"/>
+          <w:i w:val="0"/>
+        </w:rPr>
+        <w:t>Nếu bị hỏi tỉ lệ trích trang của buổi thử: xem câu 16.</w:t>
       </w:r>
     </w:p>
     <w:p>
@@ -4668,7 +4941,173 @@
           <w:b w:val="0"/>
           <w:i w:val="0"/>
         </w:rPr>
-        <w:t>Gói miễn phí không đủ: hạn mức Gemini tính theo project, Render ngủ khi không dùng. Kiến trúc không phải đổi, chỉ cần gói trả phí. [Chi phí mỗi câu hỏi: cần tính, xem mục bổ sung.]</w:t>
+        <w:t>Gói miễn phí không đủ: hạn mức Gemini tính theo project, Render ngủ khi không dùng. Kiến trúc không phải đổi, chỉ cần gói trả phí.</w:t>
+      </w:r>
+    </w:p>
+    <w:p>
+      <w:pPr>
+        <w:pStyle w:val="ListBullet2"/>
+        <w:spacing w:after="60"/>
+      </w:pPr>
+      <w:r>
+        <w:rPr>
+          <w:b w:val="0"/>
+          <w:i w:val="0"/>
+        </w:rPr>
+        <w:t xml:space="preserve">Chi phí AI </w:t>
+      </w:r>
+      <w:r>
+        <w:rPr>
+          <w:b/>
+          <w:i w:val="0"/>
+        </w:rPr>
+        <w:t>khoảng 50 đồng một câu hỏi</w:t>
+      </w:r>
+      <w:r>
+        <w:rPr>
+          <w:b w:val="0"/>
+          <w:i w:val="0"/>
+        </w:rPr>
+        <w:t>, đo thật ngày 17/10 trên 37 câu của bộ thử: thấp nhất 42 đồng, cao nhất 66 đồng. Một câu gửi Gemini trung vị khoảng 6.500 token (luật sư phạm, đoạn sách, lịch sử chat) và nhận về khoảng 200 token. Giá Gemini 3.1 Flash-Lite: 0,25 USD mỗi triệu token vào, 1,50 USD mỗi triệu token ra. Embedding và lượt phân loại phạm vi gần như không tốn.</w:t>
+      </w:r>
+    </w:p>
+    <w:p>
+      <w:pPr>
+        <w:pStyle w:val="ListBullet2"/>
+        <w:spacing w:after="60"/>
+      </w:pPr>
+      <w:r>
+        <w:rPr>
+          <w:b w:val="0"/>
+          <w:i w:val="0"/>
+        </w:rPr>
+        <w:t>Một học sinh hỏi 10 câu/ngày, 22 ngày/tháng: khoảng 11.000 đồng/tháng. 1.000 học sinh: khoảng 400 USD/tháng tiền AI, chưa tính máy chủ và câu có ảnh.</w:t>
+      </w:r>
+    </w:p>
+    <w:p>
+      <w:pPr>
+        <w:pStyle w:val="ListBullet2"/>
+        <w:spacing w:after="60"/>
+      </w:pPr>
+      <w:r>
+        <w:rPr>
+          <w:b w:val="0"/>
+          <w:i w:val="0"/>
+        </w:rPr>
+        <w:t>Câu có ảnh đề đắt hơn: từ 17/10 dùng Gemini 3.5 Flash để đọc và soát bài kỹ hơn. Đo thật ngày 17/10: khoảng 490–1.560 đồng một câu, trung bình khoảng 1.000 đồng (gần 6.000–9.300 token vào, 160–860 token trả lời, cộng phần mô hình suy nghĩ). Mỗi em giới hạn 10 ảnh/ngày. Ảnh nhoè nặng thì Mimo nhờ chụp lại, không gọi mô hình, 0 đồng.</w:t>
+      </w:r>
+    </w:p>
+    <w:p>
+      <w:pPr>
+        <w:pStyle w:val="ListBullet2"/>
+        <w:spacing w:after="60"/>
+      </w:pPr>
+      <w:r>
+        <w:rPr>
+          <w:b w:val="0"/>
+          <w:i w:val="0"/>
+        </w:rPr>
+        <w:t>Giảm được: đổi sang Gemini 2.5 Flash-Lite (rẻ khoảng 3 lần), hoặc cache phần luật sư phạm cố định (3.800 token câu nào cũng gửi).</w:t>
+      </w:r>
+    </w:p>
+    <w:p>
+      <w:pPr>
+        <w:keepNext/>
+        <w:spacing w:before="80" w:after="60"/>
+        <w:ind w:left="340" w:hanging="340"/>
+      </w:pPr>
+      <w:r>
+        <w:rPr>
+          <w:b w:val="0"/>
+          <w:i w:val="0"/>
+        </w:rPr>
+        <w:t xml:space="preserve">16. </w:t>
+      </w:r>
+      <w:r>
+        <w:rPr>
+          <w:b/>
+          <w:i w:val="0"/>
+        </w:rPr>
+        <w:t>Buổi thử có 368 câu mà chỉ 36 câu có trang sách?</w:t>
+      </w:r>
+    </w:p>
+    <w:p>
+      <w:pPr>
+        <w:pStyle w:val="ListBullet2"/>
+        <w:spacing w:after="60"/>
+      </w:pPr>
+      <w:r>
+        <w:rPr>
+          <w:b w:val="0"/>
+          <w:i w:val="0"/>
+        </w:rPr>
+        <w:t>Đa số lượt chat là em trả lời Mimo hoặc nói tiếp ("Đáp án là B ạ", "Em làm xong rồi đây"), không cần trang. Câu hỏi bài thật chỉ có 124 câu, 36 câu có trang.</w:t>
+      </w:r>
+    </w:p>
+    <w:p>
+      <w:pPr>
+        <w:pStyle w:val="ListBullet2"/>
+        <w:spacing w:after="60"/>
+      </w:pPr>
+      <w:r>
+        <w:rPr>
+          <w:b w:val="0"/>
+          <w:i w:val="0"/>
+        </w:rPr>
+        <w:t>Nhóm đọc lại từng câu và tìm ra lý do: "Giảng lại … cho em" bị coi như lời chào, 10 cuốn sách còn thiếu trang scan, câu hướng dẫn bài tập thì mô hình lúc gắn trang lúc không. Cả ba đã sửa trong đêm 16/10 và sáng 17/10.</w:t>
+      </w:r>
+    </w:p>
+    <w:p>
+      <w:pPr>
+        <w:pStyle w:val="ListBullet2"/>
+        <w:spacing w:after="60"/>
+      </w:pPr>
+      <w:r>
+        <w:rPr>
+          <w:b w:val="0"/>
+          <w:i w:val="0"/>
+        </w:rPr>
+        <w:t xml:space="preserve">Chạy lại 25 câu hỏi bài thật của buổi thử trên bản hiện tại: </w:t>
+      </w:r>
+      <w:r>
+        <w:rPr>
+          <w:b/>
+          <w:i w:val="0"/>
+        </w:rPr>
+        <w:t>từ 10/25 lên 18/25 câu có trang</w:t>
+      </w:r>
+      <w:r>
+        <w:rPr>
+          <w:b w:val="0"/>
+          <w:i w:val="0"/>
+        </w:rPr>
+        <w:t>. Toán 11/12, Lịch sử – Địa lí 5/5, Ngữ văn 2/2.</w:t>
+      </w:r>
+    </w:p>
+    <w:p>
+      <w:pPr>
+        <w:pStyle w:val="ListBullet2"/>
+        <w:spacing w:after="60"/>
+      </w:pPr>
+      <w:r>
+        <w:rPr>
+          <w:b w:val="0"/>
+          <w:i w:val="0"/>
+        </w:rPr>
+        <w:t>Tiếng Anh thì ba bản sửa đó chưa đủ: Mimo giảng bằng tiếng Việt còn sách là tiếng Anh nên không gắn được trang, và mục "Skills 1", "Getting Started" lặp ở mọi Unit nên Mimo trích nhầm Unit. Sửa chiều 17/10: trang của bài đang mở luôn được trích, câu chép lại từ tiếng Anh của sách được giữ số trích dẫn, câu hỏi gọi tên mục chỉ lấy trang của đúng Unit.</w:t>
+      </w:r>
+    </w:p>
+    <w:p>
+      <w:pPr>
+        <w:pStyle w:val="ListBullet2"/>
+        <w:spacing w:after="60"/>
+      </w:pPr>
+      <w:r>
+        <w:rPr>
+          <w:b w:val="0"/>
+          <w:i w:val="0"/>
+        </w:rPr>
+        <w:t>Dò 4 câu mỗi lớp cho cả 20 môn/lớp sau khi sửa: Tiếng Anh 15/16 câu có trang, cả 15 đúng Unit (trước đó 10/16 và câu nào cũng lẫn trang Unit khác); các môn còn lại 64/64.</w:t>
       </w:r>
     </w:p>
     <w:p>
@@ -4688,7 +5127,7 @@
           <w:b w:val="0"/>
           <w:i w:val="0"/>
         </w:rPr>
-        <w:t>Xếp theo mức ảnh hưởng tới buổi thi. Mục 1–4 nên xong tối nay.</w:t>
+        <w:t>Các mục chưa đánh dấu xếp theo mức ảnh hưởng tới buổi thi; ba mục đầu nên xong tối nay.</w:t>
       </w:r>
     </w:p>
     <w:p>
@@ -4701,7 +5140,7 @@
           <w:b w:val="0"/>
           <w:i w:val="0"/>
         </w:rPr>
-        <w:t>☐ Điền tên người nói vào bảng phân vai, tập cả bài 2 lần có bấm giờ (mục tiêu 5:45–6:00).</w:t>
+        <w:t>☐ Điền tên người nói vào bảng phân vai, tập cả bài 2 lần có bấm giờ (mục tiêu 6:00–6:10).</w:t>
       </w:r>
     </w:p>
     <w:p>
@@ -4714,7 +5153,24 @@
           <w:b w:val="0"/>
           <w:i w:val="0"/>
         </w:rPr>
-        <w:t>☐ Chạy thử 5 câu demo trên bản deploy, thay câu nào Mimo trả lời chưa đẹp.</w:t>
+        <w:t xml:space="preserve">☑ Chạy thử 5 câu demo trên bản deploy (17/10). Đã thay câu 2; kết quả ở </w:t>
+      </w:r>
+      <w:r>
+        <w:rPr>
+          <w:rFonts w:ascii="Consolas" w:hAnsi="Consolas"/>
+          <w:b w:val="0"/>
+          <w:i w:val="0"/>
+          <w:color w:val="F2704F"/>
+          <w:sz w:val="21"/>
+        </w:rPr>
+        <w:t>KET_QUA_CHAY_THU_DEMO.md</w:t>
+      </w:r>
+      <w:r>
+        <w:rPr>
+          <w:b w:val="0"/>
+          <w:i w:val="0"/>
+        </w:rPr>
+        <w:t>.</w:t>
       </w:r>
     </w:p>
     <w:p>
@@ -4727,7 +5183,7 @@
           <w:b w:val="0"/>
           <w:i w:val="0"/>
         </w:rPr>
-        <w:t xml:space="preserve">☐ Lấy số vector thật từ </w:t>
+        <w:t xml:space="preserve">☑ Số vector thật: </w:t>
       </w:r>
       <w:r>
         <w:rPr>
@@ -4744,7 +5200,7 @@
           <w:b w:val="0"/>
           <w:i w:val="0"/>
         </w:rPr>
-        <w:t xml:space="preserve"> sau đợt nạp lại 17/10, sửa "~4.700 đoạn" và "29 cuốn, 5 môn" nếu lệch.</w:t>
+        <w:t xml:space="preserve"> báo 5.498 đoạn, sổ nạp ghi 29 cuốn, 5 môn, lớp 6–9. Đã sửa.</w:t>
       </w:r>
     </w:p>
     <w:p>
@@ -4757,7 +5213,7 @@
           <w:b w:val="0"/>
           <w:i w:val="0"/>
         </w:rPr>
-        <w:t xml:space="preserve">☐ Điền số liệu buổi học sinh dùng thử (câu 11): số bạn, số lần Mimo giải hết bài, điểm tự làm tiếp. Chưa có file </w:t>
+        <w:t xml:space="preserve">☑ Số liệu buổi dùng thử 16/10 từ hệ thống: 34 bạn, 368 câu (câu 11, </w:t>
       </w:r>
       <w:r>
         <w:rPr>
@@ -4767,14 +5223,14 @@
           <w:color w:val="F2704F"/>
           <w:sz w:val="21"/>
         </w:rPr>
-        <w:t>KET_QUA_KHAO_SAT.md</w:t>
+        <w:t>thu-nghiem/KET_QUA_DUNG_THU_1610.md</w:t>
       </w:r>
       <w:r>
         <w:rPr>
           <w:b w:val="0"/>
           <w:i w:val="0"/>
         </w:rPr>
-        <w:t xml:space="preserve"> trong repo.</w:t>
+        <w:t>).</w:t>
       </w:r>
     </w:p>
     <w:p>
@@ -4787,7 +5243,7 @@
           <w:b w:val="0"/>
           <w:i w:val="0"/>
         </w:rPr>
-        <w:t>☐ Tính chi phí ước lượng mỗi câu hỏi nếu dùng gói trả phí (câu 15).</w:t>
+        <w:t>☐ Điền số từ Google Form vào câu 11: mấy bạn thấy Mimo giải hết bài, điểm tự làm tiếp trung bình.</w:t>
       </w:r>
     </w:p>
     <w:p>
@@ -4800,7 +5256,7 @@
           <w:b w:val="0"/>
           <w:i w:val="0"/>
         </w:rPr>
-        <w:t>☐ Hỏi lại thầy cô chỗ sai cụ thể ở câu 24, 28 và đánh giá câu 6.</w:t>
+        <w:t>☑ Chi phí mỗi câu hỏi đo thật: khoảng 50 đồng câu chữ, khoảng 1.000 đồng câu có ảnh (câu 15).</w:t>
       </w:r>
     </w:p>
     <w:p>
@@ -4813,7 +5269,7 @@
           <w:b w:val="0"/>
           <w:i w:val="0"/>
         </w:rPr>
-        <w:t>☐ Kiểm tra video demo dự phòng còn khớp giao diện hiện tại (khung chat đã đổi ở d52b06d).</w:t>
+        <w:t>☐ Tạo một tài khoản demo chưa luyện bài 6 Toán 8 cho phần luyện tập.</w:t>
       </w:r>
     </w:p>
     <w:p>
@@ -4826,7 +5282,7 @@
           <w:b w:val="0"/>
           <w:i w:val="0"/>
         </w:rPr>
-        <w:t xml:space="preserve">☐ Commit các file đang sửa dở trong </w:t>
+        <w:t xml:space="preserve">☑ Vì sao chỉ 36/368 câu buổi 16/10 có trang: đã tìm ra, chạy lại 25 câu được 18/25 (câu 16, </w:t>
       </w:r>
       <w:r>
         <w:rPr>
@@ -4836,14 +5292,79 @@
           <w:color w:val="F2704F"/>
           <w:sz w:val="21"/>
         </w:rPr>
-        <w:t>bao-cao/</w:t>
+        <w:t>thu-nghiem/KET_QUA_DUNG_THU_1610.md</w:t>
       </w:r>
       <w:r>
         <w:rPr>
           <w:b w:val="0"/>
           <w:i w:val="0"/>
         </w:rPr>
-        <w:t xml:space="preserve"> (hồ sơ v5, </w:t>
+        <w:t>). Vẫn đừng nói "câu nào cũng có trang".</w:t>
+      </w:r>
+    </w:p>
+    <w:p>
+      <w:pPr>
+        <w:spacing w:after="60"/>
+        <w:ind w:left="340"/>
+      </w:pPr>
+      <w:r>
+        <w:rPr>
+          <w:b w:val="0"/>
+          <w:i w:val="0"/>
+        </w:rPr>
+        <w:t>☑ Tiếng Anh gắn đúng trang, đúng Unit (commit 52eacf6, đã push 17/10): 15/16 câu có trang, cả 15 đúng Unit.</w:t>
+      </w:r>
+    </w:p>
+    <w:p>
+      <w:pPr>
+        <w:spacing w:after="60"/>
+        <w:ind w:left="340"/>
+      </w:pPr>
+      <w:r>
+        <w:rPr>
+          <w:b w:val="0"/>
+          <w:i w:val="0"/>
+        </w:rPr>
+        <w:t>☐ (Sau buổi thi) "Tính nhanh 102² bằng hằng đẳng thức" hỏi riêng bị trả về "chưa xác định được phần học".</w:t>
+      </w:r>
+    </w:p>
+    <w:p>
+      <w:pPr>
+        <w:spacing w:after="60"/>
+        <w:ind w:left="340"/>
+      </w:pPr>
+      <w:r>
+        <w:rPr>
+          <w:b w:val="0"/>
+          <w:i w:val="0"/>
+        </w:rPr>
+        <w:t>☐ Hỏi lại thầy cô chỗ sai cụ thể ở câu 24.</w:t>
+      </w:r>
+    </w:p>
+    <w:p>
+      <w:pPr>
+        <w:spacing w:after="60"/>
+        <w:ind w:left="340"/>
+      </w:pPr>
+      <w:r>
+        <w:rPr>
+          <w:b w:val="0"/>
+          <w:i w:val="0"/>
+        </w:rPr>
+        <w:t>☐ Kiểm tra video demo dự phòng còn khớp giao diện hiện tại (khung chat đã đổi ở d52b06d).</w:t>
+      </w:r>
+    </w:p>
+    <w:p>
+      <w:pPr>
+        <w:spacing w:after="60"/>
+        <w:ind w:left="340"/>
+      </w:pPr>
+      <w:r>
+        <w:rPr>
+          <w:b w:val="0"/>
+          <w:i w:val="0"/>
+        </w:rPr>
+        <w:t xml:space="preserve">☐ Commit các file mới: </w:t>
       </w:r>
       <w:r>
         <w:rPr>
@@ -4853,7 +5374,7 @@
           <w:color w:val="F2704F"/>
           <w:sz w:val="21"/>
         </w:rPr>
-        <w:t>KET_QUA_TEST.md</w:t>
+        <w:t>KET_QUA_CHAY_THU_DEMO.md</w:t>
       </w:r>
       <w:r>
         <w:rPr>
@@ -4870,14 +5391,14 @@
           <w:color w:val="F2704F"/>
           <w:sz w:val="21"/>
         </w:rPr>
-        <w:t>so-sanh-nan-ni/</w:t>
+        <w:t>thu-nghiem/KET_QUA_DUNG_THU_1610.md</w:t>
       </w:r>
       <w:r>
         <w:rPr>
           <w:b w:val="0"/>
           <w:i w:val="0"/>
         </w:rPr>
-        <w:t>) để bằng chứng trên repo khớp lời nói.</w:t>
+        <w:t xml:space="preserve"> và kịch bản đã sửa.</w:t>
       </w:r>
     </w:p>
     <w:p>

</xml_diff>

<commit_message>
Kết quả Google Form 12 phiếu: tự làm tiếp 4,4/5, 2/12 thấy Mimo giải hộ; đưa vào minh chứng và kịch bản thi
Chỉ ghi số tổng hợp, không có tài khoản hay tên học sinh. Bỏ file câu hỏi dựng từ tao_google_form.gs vì form thật khác.

Co-Authored-By: Claude Opus 5.5 <noreply@anthropic.com>
</commit_message>
<xml_diff>
--- a/bao-cao/kich-ban-thi/Kich_ban_thi.docx
+++ b/bao-cao/kich-ban-thi/Kich_ban_thi.docx
@@ -4745,7 +4745,52 @@
           <w:b w:val="0"/>
           <w:i w:val="0"/>
         </w:rPr>
-        <w:t>[Điền số từ Google Form: mấy bạn thấy Mimo giải hết bài, điểm tự làm tiếp trung bình trên thang 1–5.]</w:t>
+        <w:t xml:space="preserve">Google Form 12 phiếu: 10/12 bạn thấy Mimo chỉ gợi ý bước đầu, </w:t>
+      </w:r>
+      <w:r>
+        <w:rPr>
+          <w:b/>
+          <w:i w:val="0"/>
+        </w:rPr>
+        <w:t>2/12 bạn thấy Mimo giải hộ</w:t>
+      </w:r>
+      <w:r>
+        <w:rPr>
+          <w:b w:val="0"/>
+          <w:i w:val="0"/>
+        </w:rPr>
+        <w:t xml:space="preserve">; tự làm tiếp được trung bình </w:t>
+      </w:r>
+      <w:r>
+        <w:rPr>
+          <w:b/>
+          <w:i w:val="0"/>
+        </w:rPr>
+        <w:t>4,4/5</w:t>
+      </w:r>
+      <w:r>
+        <w:rPr>
+          <w:b w:val="0"/>
+          <w:i w:val="0"/>
+        </w:rPr>
+        <w:t xml:space="preserve">; 7/12 mở đúng trang sách, 5/12 gặp trang lệch hoặc không mở được. Nếu bị hỏi về 2 phiếu "giải hộ": nói thật là bộ thử đo 0/14 nhưng học sinh thật vẫn tìm ra cách hỏi bộ thử chưa phủ, nhóm sẽ đọc lại hội thoại đó và thêm vào bộ thử. Xem </w:t>
+      </w:r>
+      <w:r>
+        <w:rPr>
+          <w:rFonts w:ascii="Consolas" w:hAnsi="Consolas"/>
+          <w:b w:val="0"/>
+          <w:i w:val="0"/>
+          <w:color w:val="F2704F"/>
+          <w:sz w:val="21"/>
+        </w:rPr>
+        <w:t>thu-nghiem/KET_QUA_GOOGLE_FORM.md</w:t>
+      </w:r>
+      <w:r>
+        <w:rPr>
+          <w:b w:val="0"/>
+          <w:i w:val="0"/>
+        </w:rPr>
+        <w:t>.</w:t>
       </w:r>
     </w:p>
     <w:p>
@@ -5243,7 +5288,7 @@
           <w:b w:val="0"/>
           <w:i w:val="0"/>
         </w:rPr>
-        <w:t>☐ Điền số từ Google Form vào câu 11: mấy bạn thấy Mimo giải hết bài, điểm tự làm tiếp trung bình.</w:t>
+        <w:t>☑ Điền số từ Google Form vào câu 11: 2/12 thấy Mimo giải hộ, tự làm tiếp trung bình 4,4/5.</w:t>
       </w:r>
     </w:p>
     <w:p>

</xml_diff>